<commit_message>
Finalize corrected research paper and reviewed submission archive
</commit_message>
<xml_diff>
--- a/reports/Sentiment_Analysis_Research_Paper.docx
+++ b/reports/Sentiment_Analysis_Research_Paper.docx
@@ -29,7 +29,7 @@
         <w:rPr>
           <w:sz w:val="30"/>
         </w:rPr>
-        <w:t>Classifying Airline Customer Tweets with Classical Machine Learning, Recurrent Networks and Transformers</w:t>
+        <w:t>Classifying Airline Customer Feedback with Classical Machine Learning and a Bidirectional LSTM</w:t>
       </w:r>
     </w:p>
     <w:p/>
@@ -50,10 +50,7 @@
         <w:t xml:space="preserve">Author: </w:t>
       </w:r>
       <w:r>
-        <w:rPr>
-          <w:highlight w:val="yellow"/>
-        </w:rPr>
-        <w:t>[Your Name]</w:t>
+        <w:t>Albert Kabore, PhD Student in AI</w:t>
       </w:r>
     </w:p>
     <w:p>
@@ -61,38 +58,10 @@
         <w:jc w:val="center"/>
       </w:pPr>
       <w:r>
-        <w:t xml:space="preserve">Course: </w:t>
-      </w:r>
-      <w:r>
-        <w:rPr>
-          <w:highlight w:val="yellow"/>
-        </w:rPr>
-        <w:t>[Course Name and Number]</w:t>
-      </w:r>
-    </w:p>
-    <w:p>
-      <w:pPr>
-        <w:jc w:val="center"/>
-      </w:pPr>
-      <w:r>
-        <w:t xml:space="preserve">Instructor: </w:t>
-      </w:r>
-      <w:r>
-        <w:rPr>
-          <w:highlight w:val="yellow"/>
-        </w:rPr>
-        <w:t>[Instructor Name]</w:t>
-      </w:r>
-    </w:p>
-    <w:p>
-      <w:pPr>
-        <w:jc w:val="center"/>
-      </w:pPr>
-      <w:r>
         <w:t xml:space="preserve">Date: </w:t>
       </w:r>
       <w:r>
-        <w:t>October 02, 2026</w:t>
+        <w:t>October 03, 2026</w:t>
       </w:r>
     </w:p>
     <w:p>
@@ -110,7 +79,7 @@
     </w:p>
     <w:p>
       <w:r>
-        <w:t xml:space="preserve">Airlines receive public customer feedback on social media; most tweets in the selected dataset are negative. This study builds and compares sentiment-analysis models that classify airline customer tweets as negative, neutral or positive, and examines how their output can support business decisions. Using the Twitter US Airline Sentiment dataset (14,485 tweets after cleaning; 63% negative, 21% neutral, 16% positive), tweets were normalised, tokenised, lemmatised and filtered for stop words and punctuation, then represented with TF-IDF word and character n-grams and Word2Vec embeddings. We compared six models: Multinomial Naive Bayes, Logistic Regression and Linear Support Vector Machines (SVM) on TF-IDF features, Logistic Regression on Word2Vec features, a bidirectional LSTM recurrent network. Classical models were tuned by stratified 5-fold cross-validation, and every model was evaluated once on the same held-out test set with accuracy, macro-averaged precision, recall and F1, ROC-AUC, bootstrap confidence intervals and McNemar's test. The best model was the </w:t>
+        <w:t xml:space="preserve">This study evaluates three-class sentiment classification of airline customer feedback. The corpus is predominantly negative. The evaluated models assign customer tweets to negative, neutral or positive classes. Using the Twitter US Airline Sentiment dataset (14,485 tweets after cleaning; 63% negative, 21% neutral, 16% positive), tweets were normalised, tokenised, lemmatised and filtered for stop words and punctuation, then represented with TF-IDF word and character n-grams and Word2Vec embeddings. The experiment compared six configurations: Multinomial Naive Bayes and Logistic Regression on word TF-IDF, Linear Support Vector Machines (SVM) on word TF-IDF and combined word-and-character TF-IDF, Logistic Regression on Word2Vec, and a bidirectional LSTM recurrent network. Classical models were tuned by stratified 5-fold cross-validation, and every model was evaluated on the same test set with accuracy, macro-averaged precision, recall and F1, ROC-AUC, bootstrap confidence intervals and McNemar's test. The highest test macro-F1 was obtained by the </w:t>
       </w:r>
       <w:r>
         <w:rPr>
@@ -119,7 +88,7 @@
         <w:t>Linear SVM (word+char)</w:t>
       </w:r>
       <w:r>
-        <w:t>, with accuracy 0.814 and macro-F1 0.766 (95% CI 0.746–0.785); the BiLSTM reached macro-F1 0.762; a DistilRoBERTa Transformer was implemented, but its fine-tuning could not be completed on the available CPU-only hardware and it is reported as future work. Neutral tweets were the hardest class (F1 0.661). Model-predicted Net Sentiment Scores matched human-labelled scores per airline to within 1.7 points on average, and at an exploratory test-selected threshold that catches 95% of negative tweets, 80% of flagged tweets were truly negative. The results show potential for a fast linear model to support complaint triage and service monitoring. The triage thresholds were selected on the test set and are exploratory; deployment requires independent validation.</w:t>
+        <w:t>, with accuracy 0.814 and macro-F1 0.766 (95% CI 0.746–0.785); the BiLSTM reached macro-F1 0.762; DistilRoBERTa training code is included as an optional extension, but completed evaluation results are unavailable. Neutral tweets had the lowest class-specific F1 (F1 0.661). The mean absolute discrepancy between predicted and annotated airline Net Sentiment Scores was 1.7 points. At an exploratory threshold selected to recover 95% of negative tweets, 80% of flagged tweets were negative. These estimates indicate possible applications in complaint triage and sentiment monitoring. The triage thresholds were selected on the test set and are exploratory; deployment requires independent validation.</w:t>
       </w:r>
     </w:p>
     <w:p>
@@ -151,7 +120,7 @@
     </w:p>
     <w:p>
       <w:r>
-        <w:t>Sentiment analysis is the automatic identification of the opinion or attitude expressed in text (Pang &amp; Lee, 2008; Liu, 2012). Early systems relied on sentiment word lists. Supervised machine learning on bag-of-words features then became the standard approach, and neural networks followed: recurrent networks that read text in order (Hochreiter &amp; Schmidhuber, 1997) and, most recently, pre-trained Transformer language models (Devlin et al., 2019; Liu et al., 2019) that are fine-tuned for the task.</w:t>
+        <w:t>Sentiment analysis is the automatic identification of the opinion or attitude expressed in text (Pang &amp; Lee, 2008; Liu, 2012). Lexicon-based methods assign sentiment using predefined word lists. Supervised classifiers learn decision functions from labelled text represented as bag-of-words features. Recurrent networks encode token sequences (Hochreiter &amp; Schmidhuber, 1997), while pretrained Transformer language models learn contextual representations that can be fine-tuned for classification (Devlin et al., 2019; Liu et al., 2019).</w:t>
       </w:r>
     </w:p>
     <w:p>
@@ -164,7 +133,7 @@
     </w:p>
     <w:p>
       <w:r>
-        <w:t>Air travel is a service business with frequent, visible failures: delays, cancellations, lost bags and long call-centre waits. Customers increasingly report these problems publicly on Twitter (now X) and expect a fast reply. For an airline, this feedback is both a risk and a resource. Unanswered complaints damage the brand in public, but the same stream shows, in near real time, which operational problems customers notice most. The volume is too high to read manually, so an accurate automatic classifier can (1) route negative tweets to service agents quickly, (2) track sentiment over time and across competitors, and (3) quantify the causes of dissatisfaction.</w:t>
+        <w:t>Airline customer feedback includes reports of delays, cancellations, baggage problems and service interactions. Classifying these messages can help service teams prioritize review and summarize patterns in feedback. This study examines those potential uses through a historical Twitter dataset. Sentiment classification identifies the expressed attitude; it does not establish the causes of dissatisfaction or the effects of a business intervention.</w:t>
       </w:r>
     </w:p>
     <w:p>
@@ -199,7 +168,7 @@
         <w:spacing w:after="60"/>
       </w:pPr>
       <w:r>
-        <w:t>Compare sparse (TF-IDF) and dense (Word2Vec, contextual) feature representations.</w:t>
+        <w:t>Compare sparse TF-IDF features with dense Word2Vec representations and a BiLSTM sequence model.</w:t>
       </w:r>
     </w:p>
     <w:p>
@@ -208,7 +177,7 @@
         <w:spacing w:after="60"/>
       </w:pPr>
       <w:r>
-        <w:t>Train and tune classical machine-learning models (Naive Bayes, Logistic Regression, SVM) and deep-learning models (RNN, Transformer).</w:t>
+        <w:t>Train and tune Naive Bayes, Logistic Regression, SVM and BiLSTM models; document Transformer code as an optional extension.</w:t>
       </w:r>
     </w:p>
     <w:p>
@@ -226,7 +195,7 @@
         <w:spacing w:after="60"/>
       </w:pPr>
       <w:r>
-        <w:t>Translate the results into recommendations for customer-experience and operations teams.</w:t>
+        <w:t>Assess the implications of classification errors for complaint routing and aggregate sentiment reporting.</w:t>
       </w:r>
     </w:p>
     <w:p>
@@ -307,7 +276,7 @@
     </w:p>
     <w:p>
       <w:r>
-        <w:t>Exploration revealed three data-quality problems, handled as follows:</w:t>
+        <w:t>The data audit identified duplicate identifiers, inconsistent airline assignments and text artefacts:</w:t>
       </w:r>
     </w:p>
     <w:p>
@@ -322,7 +291,7 @@
         <w:t>Duplicate tweets.</w:t>
       </w:r>
       <w:r>
-        <w:t xml:space="preserve"> 155 rows repeated an existing tweet ID, and 18 of those duplicate pairs had conflicting sentiment labels. One row per tweet was kept, choosing the annotation with the highest confidence.</w:t>
+        <w:t xml:space="preserve"> 155 rows repeated an existing tweet ID, and 18 duplicate identifiers were associated with conflicting sentiment labels. One row per tweet was kept, choosing the annotation with the highest confidence.</w:t>
       </w:r>
     </w:p>
     <w:p>
@@ -334,10 +303,10 @@
         <w:rPr>
           <w:b/>
         </w:rPr>
-        <w:t>Mislabelled airline.</w:t>
-      </w:r>
-      <w:r>
-        <w:t xml:space="preserve"> All 2,222 rows labelled </w:t>
+        <w:t>Airline assignment.</w:t>
+      </w:r>
+      <w:r>
+        <w:t xml:space="preserve"> Of the 2,222 rows labelled </w:t>
       </w:r>
       <w:r>
         <w:rPr>
@@ -346,7 +315,7 @@
         <w:t>Delta</w:t>
       </w:r>
       <w:r>
-        <w:t xml:space="preserve"> are, in 99.8% of cases, addressed to @JetBlue. The airline field was corrected to JetBlue so that airline-level insights are not misattributed. The tweet text and sentiment labels were not changed.</w:t>
+        <w:t>, 99.8% contain @JetBlue. These rows were reassigned to JetBlue for airline-level analysis. This is a dataset-level assumption rather than verification of the intended carrier for every tweet. Tweet text and sentiment labels were retained.</w:t>
       </w:r>
     </w:p>
     <w:p>
@@ -1072,7 +1041,7 @@
     </w:p>
     <w:p>
       <w:r>
-        <w:t xml:space="preserve">The classes are clearly </w:t>
+        <w:t xml:space="preserve">The class distribution is </w:t>
       </w:r>
       <w:r>
         <w:rPr>
@@ -2191,7 +2160,7 @@
         <w:t>src/preprocessing.py</w:t>
       </w:r>
       <w:r>
-        <w:t>. It applies the steps required by the assignment (tokenisation, lemmatisation, stop-word and punctuation removal) after a normalisation stage designed for tweets:</w:t>
+        <w:t>. It applies the steps required by the assignment (tokenisation, lemmatisation, stop-word and punctuation removal) following tweet-specific normalisation:</w:t>
       </w:r>
     </w:p>
     <w:p>
@@ -2303,7 +2272,7 @@
         <w:t>Mentions and URLs</w:t>
       </w:r>
       <w:r>
-        <w:t xml:space="preserve"> identify the airline or a link rather than the opinion. Keeping them would let a model learn each airline's average sentiment instead of reading the text.</w:t>
+        <w:t xml:space="preserve"> were removed to limit reliance on airline identifiers and linked content. Retaining them could allow a classifier to exploit airline-specific class frequencies.</w:t>
       </w:r>
     </w:p>
     <w:p>
@@ -2315,10 +2284,10 @@
         <w:rPr>
           <w:b/>
         </w:rPr>
-        <w:t>Emoji are converted, not deleted,</w:t>
-      </w:r>
-      <w:r>
-        <w:t xml:space="preserve"> because on social media they are some of the strongest sentiment signals (e.g. emo_smile and emo_folded_hands are among the most typical positive tokens).</w:t>
+        <w:t>Emoji</w:t>
+      </w:r>
+      <w:r>
+        <w:t xml:space="preserve"> were mapped to lexical tokens to retain affective information. Observed positive-class associations include emo_smile and emo_folded_hands.</w:t>
       </w:r>
     </w:p>
     <w:p>
@@ -2384,15 +2353,15 @@
         <w:rPr>
           <w:b/>
         </w:rPr>
-        <w:t>The BiLSTM keeps stop words.</w:t>
-      </w:r>
-      <w:r>
-        <w:t xml:space="preserve"> A sequence model needs function words to model word order and the scope of negations.</w:t>
+        <w:t>BiLSTM preprocessing</w:t>
+      </w:r>
+      <w:r>
+        <w:t xml:space="preserve"> retains stop words to preserve sequence structure and potential cues to negation scope.</w:t>
       </w:r>
     </w:p>
     <w:p>
       <w:r>
-        <w:t>Preprocessing cut the corpus from 255,803 raw tokens to 128,920, and the vocabulary from 26,840 to 9,040 distinct terms. Only 28 tweets became empty. Figure 4 shows the most distinctive terms per class after preprocessing, measured by weighted log-odds with an informative Dirichlet prior (Monroe et al., 2008). The terms are clearly interpretable: waiting and delays (</w:t>
+        <w:t>Preprocessing reduced the corpus from 255,803 raw tokens to 128,920, and the vocabulary from 26,840 to 9,040 distinct terms. Only 28 tweets became empty. Figure 4 shows the most distinctive terms per class after preprocessing, measured by weighted log-odds with an informative Dirichlet prior (Monroe et al., 2008). The identified terms include waiting and delays (</w:t>
       </w:r>
       <w:r>
         <w:rPr>
@@ -2473,12 +2442,12 @@
         <w:pStyle w:val="Heading2"/>
       </w:pPr>
       <w:r>
-        <w:t>3.3 Ablation: what does each step contribute?</w:t>
+        <w:t>3.3 Preprocessing ablation</w:t>
       </w:r>
     </w:p>
     <w:p>
       <w:r>
-        <w:t>Each preprocessing step was added one at a time and scored with the tuned Linear SVM, using 5-fold cross-validated macro-F1 on the training data (Table 4).</w:t>
+        <w:t>Each preprocessing step was added one at a time and scored with the tuned Linear SVM, using 5-fold cross-validated macro-F1 on the combined training and validation data (Table 4).</w:t>
       </w:r>
     </w:p>
     <w:p>
@@ -3076,7 +3045,7 @@
         <w:t>not</w:t>
       </w:r>
       <w:r>
-        <w:t xml:space="preserve"> improve macro-F1: macro-F1 fell from 0.750 (tokenised, stop words kept) to 0.735 after stop-word removal and 0.732 after lemmatisation. Removing negations as well lowered it further to 0.721, the worst result, which confirms the decision to keep them. Short function words such as </w:t>
+        <w:t xml:space="preserve"> improve macro-F1: macro-F1 fell from 0.750 (tokenised, stop words kept) to 0.735 after stop-word removal and 0.732 after lemmatisation. Removing negations as well lowered it further to 0.721, consistent with retaining negation terms in this configuration. Short function words such as </w:t>
       </w:r>
       <w:r>
         <w:rPr>
@@ -3112,7 +3081,7 @@
         <w:t>again</w:t>
       </w:r>
       <w:r>
-        <w:t xml:space="preserve"> carry tone in complaints, and bigrams that contain them ("why not", "again") are lost when they are removed. The full pipeline was still used for the main models, as the assignment requires, because it gives a smaller and more interpretable feature space. The cost in macro-F1 is reported here openly and discussed as a limitation. These are descriptive CV results at fixed tuned hyperparameters, rather than an independently validated causal comparison.</w:t>
+        <w:t xml:space="preserve"> carry tone in complaints, and bigrams that contain them ("why not", "again") are lost when these tokens are removed. The main comparison retained the full pipeline to meet the preprocessing specification and reduce vocabulary size. The lower macro-F1 is a limitation of this choice. These descriptive cross-validation results use fixed tuned hyperparameters and do not isolate preprocessing effects under independent model selection.</w:t>
       </w:r>
     </w:p>
     <w:p>
@@ -3213,12 +3182,12 @@
         <w:t>Neural representations.</w:t>
       </w:r>
       <w:r>
-        <w:t xml:space="preserve"> The BiLSTM starts with context-independent Word2Vec token embeddings and produces contextual hidden states. The optional Transformer uses contextual sub-word states; no Transformer results are claimed unless saved predictions exist.</w:t>
+        <w:t xml:space="preserve"> The BiLSTM starts with context-independent Word2Vec token embeddings and produces contextual hidden states. The optional Transformer uses contextual sub-word states; Transformer evaluation results are unavailable for the present experiment.</w:t>
       </w:r>
     </w:p>
     <w:p>
       <w:r>
-        <w:t>All vectorisers are fitted inside scikit-learn pipelines, so vocabulary and IDF weights are learned only from the training part of each cross-validation fold and never from held-out data. Figure 5 projects the TF-IDF space to two dimensions for a balanced sample of 3,000 tweets. Positive tweets form dense regions, negative tweets occupy most of the space, and neutral tweets overlap with both. This overlap suggests that the neutral class will be the hardest to separate.</w:t>
+        <w:t>All vectorisers are fitted inside scikit-learn pipelines, so vocabulary and IDF weights are learned only from the training part of each cross-validation fold and never from held-out data. Figure 5 projects the TF-IDF space to two dimensions for a balanced sample of 3,000 tweets. The projections show class-specific regions with overlap between neutral tweets and both polar classes. The sample contains equal class counts, so spatial extent does not represent class prevalence. This overlap is descriptive; classification difficulty is assessed using held-out metrics rather than the two-dimensional projection.</w:t>
       </w:r>
     </w:p>
     <w:p>
@@ -3305,7 +3274,7 @@
         <w:t>Table 5.</w:t>
       </w:r>
       <w:r>
-        <w:t xml:space="preserve"> Implemented models and rationale; Transformer evaluation is conditional on available predictions.</w:t>
+        <w:t xml:space="preserve"> Model specifications and selection rationale; the Transformer is an unevaluated extension.</w:t>
       </w:r>
     </w:p>
     <w:tbl>
@@ -3820,7 +3789,7 @@
         <w:t>70% training, 15% validation and 15% test</w:t>
       </w:r>
       <w:r>
-        <w:t>, stratified by sentiment with a fixed random seed (42). The test set (2,173 tweets) was used only for the final evaluation, and every model was scored on exactly the same test tweets.</w:t>
+        <w:t>, stratified by sentiment with a fixed random seed (42). The test set (2,173 tweets) was excluded from parameter fitting, and every evaluated model was scored on the same tweets. The test set was also reused for exploratory model ranking and business diagnostics.</w:t>
       </w:r>
     </w:p>
     <w:p>
@@ -3862,10 +3831,10 @@
         <w:rPr>
           <w:b/>
         </w:rPr>
-        <w:t>Transformer:</w:t>
-      </w:r>
-      <w:r>
-        <w:t xml:space="preserve"> fine-tuned on the training set; the epoch with the best validation macro-F1 was kept.</w:t>
+        <w:t>Optional Transformer:</w:t>
+      </w:r>
+      <w:r>
+        <w:t xml:space="preserve"> the implementation specifies training on the training partition and checkpoint selection by validation macro-F1. No completed run is included.</w:t>
       </w:r>
     </w:p>
     <w:p>
@@ -4474,18 +4443,12 @@
         <w:t>distilroberta-base</w:t>
       </w:r>
       <w:r>
-        <w:t xml:space="preserve"> (82 million parameters) is a 6-layer distilled version of RoBERTa (Liu et al., 2019; Sanh et al., 2019). It keeps most of the accuracy of the full model at about half the inference cost, which matters for scoring live feedback. A classification head with three outputs was added, and the implementation uses AdamW (learning rate 2e-5, weight decay 0.01), batch size 32, 3 epochs, a linear schedule with 10% warm-up, and a maximum of 64 sub-word tokens per tweet (Wolf et al., 2020).</w:t>
+        <w:t xml:space="preserve"> (82 million parameters) is a 6-layer distilled version of RoBERTa (Liu et al., 2019; Sanh et al., 2019). Its reduced depth motivates evaluation under constrained computational resources; relative accuracy and inference cost were not measured in this study. The implementation adds a classification head with three outputs and uses AdamW (learning rate 2e-5, weight decay 0.01), batch size 32, 3 epochs, a linear schedule with 10% warm-up, and a maximum of 64 sub-word tokens per tweet (Wolf et al., 2020).</w:t>
       </w:r>
     </w:p>
     <w:p>
       <w:r>
-        <w:rPr>
-          <w:b/>
-        </w:rPr>
-        <w:t>Status:</w:t>
-      </w:r>
-      <w:r>
-        <w:t xml:space="preserve"> the Transformer is fully implemented (</w:t>
+        <w:t>The optional Transformer implementation (</w:t>
       </w:r>
       <w:r>
         <w:rPr>
@@ -4495,7 +4458,7 @@
         <w:t>src/transformer_model.py</w:t>
       </w:r>
       <w:r>
-        <w:t xml:space="preserve">) and can be run with </w:t>
+        <w:t xml:space="preserve">) can be run with </w:t>
       </w:r>
       <w:r>
         <w:rPr>
@@ -4514,7 +4477,7 @@
         <w:t>not</w:t>
       </w:r>
       <w:r>
-        <w:t xml:space="preserve"> included in the comparison below. Running it on a GPU or a machine with more memory is the first recommended extension (Section 7.3).</w:t>
+        <w:t xml:space="preserve"> included in the model comparison. Completing its training and evaluation is a proposed extension (Section 7.3).</w:t>
       </w:r>
     </w:p>
     <w:p>
@@ -8824,7 +8787,7 @@
     </w:p>
     <w:p>
       <w:r>
-        <w:t>For the best model, F1 is 0.878 for negative, 0.759 for positive and only 0.661 for neutral tweets. The confusion matrices (Figure 9) show why: most errors are neutral tweets predicted as negative, or the other way around. Neutral tweets are often questions about a problem ("is flight 1234 on time?"), which share vocabulary with complaints. The BiLSTM has the highest neutral recall (0.754) but lower negative recall, which illustrates a trade-off between the classes rather than a uniformly better model.</w:t>
+        <w:t>For the best model, F1 is 0.878 for negative, 0.759 for positive and 0.661 for neutral tweets. The confusion matrices (Figure 9) indicate that many errors involve neutral tweets classified as negative and negative tweets classified as neutral. Questions about an operational issue, such as "is flight 1234 on time?", may share vocabulary with complaints; this is a plausible explanation rather than a separately tested mechanism. The BiLSTM has the highest neutral recall (0.754) but lower negative recall, which illustrates a trade-off between the classes rather than a uniformly better model.</w:t>
       </w:r>
     </w:p>
     <w:p>
@@ -9018,39 +8981,21 @@
         <w:pStyle w:val="Heading2"/>
       </w:pPr>
       <w:r>
-        <w:t>7.1 What drives customer sentiment</w:t>
+        <w:t>7.1 Language associated with sentiment</w:t>
       </w:r>
     </w:p>
     <w:p>
       <w:r>
-        <w:t xml:space="preserve">The Logistic Regression coefficients (Figure 11) show which words push a tweet toward each class. Negative sentiment is driven by </w:t>
-      </w:r>
-      <w:r>
-        <w:rPr>
-          <w:b/>
-        </w:rPr>
-        <w:t>time and waiting</w:t>
-      </w:r>
-      <w:r>
-        <w:t xml:space="preserve"> (</w:t>
+        <w:t>The Logistic Regression coefficients (Figure 11) identify terms associated with each sentiment class in that model. Negative-class terms include waiting and delays (</w:t>
       </w:r>
       <w:r>
         <w:rPr>
           <w:i/>
         </w:rPr>
-        <w:t>hour, delay, hold, wait, hr, cancel</w:t>
-      </w:r>
-      <w:r>
-        <w:t xml:space="preserve">), by </w:t>
-      </w:r>
-      <w:r>
-        <w:rPr>
-          <w:b/>
-        </w:rPr>
-        <w:t>bags</w:t>
-      </w:r>
-      <w:r>
-        <w:t xml:space="preserve"> (</w:t>
+        <w:t>hour, delay, hold, wait, cancel</w:t>
+      </w:r>
+      <w:r>
+        <w:t>), baggage (</w:t>
       </w:r>
       <w:r>
         <w:rPr>
@@ -9059,16 +9004,7 @@
         <w:t>bag, lose, luggage</w:t>
       </w:r>
       <w:r>
-        <w:t xml:space="preserve">) and by </w:t>
-      </w:r>
-      <w:r>
-        <w:rPr>
-          <w:b/>
-        </w:rPr>
-        <w:t>contact with the airline</w:t>
-      </w:r>
-      <w:r>
-        <w:t xml:space="preserve"> (</w:t>
+        <w:t>) and service contact (</w:t>
       </w:r>
       <w:r>
         <w:rPr>
@@ -9077,7 +9013,7 @@
         <w:t>call, customer</w:t>
       </w:r>
       <w:r>
-        <w:t>). Positive sentiment is driven almost entirely by gratitude and praise (</w:t>
+        <w:t>). Positive-class terms include gratitude and praise (</w:t>
       </w:r>
       <w:r>
         <w:rPr>
@@ -9086,7 +9022,7 @@
         <w:t>thanks, great, love, awesome, kudos</w:t>
       </w:r>
       <w:r>
-        <w:t>) and by positive emoji. In other words, customers complain mainly about operations and service availability, not about the product (seats, food, fares).</w:t>
+        <w:t>). These associations help explain the Logistic Regression representation; they do not directly explain the leading SVM or establish causal drivers of customer satisfaction.</w:t>
       </w:r>
     </w:p>
     <w:p>
@@ -9164,7 +9100,7 @@
         <w:t>Exploratory complaint triage.</w:t>
       </w:r>
       <w:r>
-        <w:t xml:space="preserve"> With the threshold selected using test labels, the Linear SVM (word+char) catches 95% of negative tweets while 80% of the flagged tweets are truly negative; the team would review 74% of these test tweets. At 90% recall, precision rises to 86% and the review load drops to 66% (Figure 12). This gives managers an explicit trade-off between missed complaints and staff workload.</w:t>
+        <w:t xml:space="preserve"> With the threshold selected using test labels, the Linear SVM (word+char) catches 95% of negative tweets while 80% of the flagged tweets are truly negative; the team would review 74% of these test tweets. At 90% recall, precision rises to 86% and the review load drops to 66% (Figure 12). These operating points quantify the observed trade-off between complaint recall and review volume in the test sample.</w:t>
       </w:r>
     </w:p>
     <w:p>
@@ -9176,10 +9112,10 @@
         <w:rPr>
           <w:b/>
         </w:rPr>
-        <w:t>Competitive benchmarking.</w:t>
-      </w:r>
-      <w:r>
-        <w:t xml:space="preserve"> Net Sentiment Score (% positive − % negative) calculated from model predictions differs from the human-labelled score by 1.7 points on average (maximum 4.8) (Table 10, Figure 13). The airline ranking is reproduced except for JetBlue and Southwest, whose true scores differ by only 1.4 points. This supports investigating a dashboard, subject to fresh-data validation, uncertainty estimates and periodic human audits.</w:t>
+        <w:t>Airline-level sentiment estimates.</w:t>
+      </w:r>
+      <w:r>
+        <w:t xml:space="preserve"> Net Sentiment Score (% positive − % negative) calculated from model predictions differs from the human-labelled score by 1.7 points on average (maximum 4.8) (Table 10, Figure 13). The airline ranking is reproduced except for JetBlue and Southwest, whose true scores differ by only 1.4 points. Airline comparisons therefore require uncertainty estimates, validation on recent data and periodic review of classification errors.</w:t>
       </w:r>
     </w:p>
     <w:p>
@@ -9206,10 +9142,10 @@
         <w:rPr>
           <w:b/>
         </w:rPr>
-        <w:t>Where the model can be trusted.</w:t>
-      </w:r>
-      <w:r>
-        <w:t xml:space="preserve"> On tweets with annotation confidence equal to 1.0, the best model is 89% accurate; on tweets with annotator confidence between 0.60 and 0.80 it is only 62% accurate (Figure 14). Among complaint types, recall is highest for clear operational events such as cancelled flights (93%) and lowest for complaints the annotators themselves labelled </w:t>
+        <w:t>Performance by annotation confidence.</w:t>
+      </w:r>
+      <w:r>
+        <w:t xml:space="preserve"> On tweets with annotation confidence equal to 1.0, the best model is 89% accurate; on tweets with annotator confidence between 0.60 and 0.80 accuracy is 62% (Figure 14). Among complaint types, recall is highest for clear operational events such as cancelled flights (93%) and lowest for complaints the annotators themselves labelled </w:t>
       </w:r>
       <w:r>
         <w:rPr>
@@ -9218,7 +9154,7 @@
         <w:t>Can't Tell</w:t>
       </w:r>
       <w:r>
-        <w:t xml:space="preserve"> (75%). Ambiguous, sarcastic or mixed messages should go to a human reviewer.</w:t>
+        <w:t xml:space="preserve"> (75%). The association between annotation confidence and predictive accuracy motivates human review of ambiguous cases; performance on sarcasm was not evaluated separately.</w:t>
       </w:r>
     </w:p>
     <w:p>
@@ -10455,7 +10391,7 @@
         <w:rPr>
           <w:b/>
         </w:rPr>
-        <w:t>One source and one short period.</w:t>
+        <w:t>Temporal and source restrictions.</w:t>
       </w:r>
       <w:r>
         <w:t xml:space="preserve"> All tweets come from Twitter in February 2015. Language, platforms and customer issues change over time, so a deployed model should be retrained periodically and monitored for drift.</w:t>
@@ -10473,7 +10409,7 @@
         <w:t>Label noise.</w:t>
       </w:r>
       <w:r>
-        <w:t xml:space="preserve"> 28.5% of labels have annotator confidence below 1, which limits achievable accuracy, particularly for the neutral class. Weighting training examples by confidence or re-annotating ambiguous tweets would help.</w:t>
+        <w:t xml:space="preserve"> 28.5% of labels have annotator confidence below 1, which indicates annotation uncertainty. Confidence-based weighting and additional annotation review are potential improvements whose effects require evaluation.</w:t>
       </w:r>
     </w:p>
     <w:p>
@@ -10485,7 +10421,7 @@
         <w:rPr>
           <w:b/>
         </w:rPr>
-        <w:t>Preprocessing removes some signal.</w:t>
+        <w:t>Preprocessing sensitivity.</w:t>
       </w:r>
       <w:r>
         <w:t xml:space="preserve"> The ablation shows that stop-word removal and lemmatisation lower macro-F1 slightly for linear models. Preprocessing should be treated as a hyper-parameter tuned for each model.</w:t>
@@ -10500,10 +10436,10 @@
         <w:rPr>
           <w:b/>
         </w:rPr>
-        <w:t>Compute.</w:t>
-      </w:r>
-      <w:r>
-        <w:t xml:space="preserve"> The Transformer could not be fine-tuned on the available hardware. With a GPU, a larger or tweet-specific model such as TweetEval's RoBERTa (Barbieri et al., 2020) would could be evaluated for neutral-class improvements; gains are not established here.</w:t>
+        <w:t>Incomplete Transformer evaluation.</w:t>
+      </w:r>
+      <w:r>
+        <w:t xml:space="preserve"> Completed Transformer training and evaluation results are unavailable. A future experiment could evaluate a Transformer on tweet classification, using benchmarks such as TweetEval (Barbieri et al., 2020) to inform the design. Any improvement would need to be measured.</w:t>
       </w:r>
     </w:p>
     <w:p>
@@ -10515,7 +10451,7 @@
         <w:rPr>
           <w:b/>
         </w:rPr>
-        <w:t>Coarse labels.</w:t>
+        <w:t>Label granularity.</w:t>
       </w:r>
       <w:r>
         <w:t xml:space="preserve"> One label per tweet cannot represent mixed opinions ("great crew, terrible delay"). Aspect-based sentiment analysis would separate opinions about crew, punctuality, baggage and service.</w:t>
@@ -10533,7 +10469,7 @@
         <w:t>Dataset artefacts.</w:t>
       </w:r>
       <w:r>
-        <w:t xml:space="preserve"> The text substitutions described in Section 2.2 add noise that a cleaned version of the source data would avoid.</w:t>
+        <w:t xml:space="preserve"> The unusual strings described in Section 2.2 may introduce lexical noise. An independently verified version of the source text would permit evaluation of their effect.</w:t>
       </w:r>
     </w:p>
     <w:p>
@@ -10546,7 +10482,7 @@
     </w:p>
     <w:p>
       <w:r>
-        <w:t xml:space="preserve">This study compared six sentiment-analysis models on 14,485 airline customer tweets, using a documented preprocessing pipeline, three feature representations and a single held-out test set. The </w:t>
+        <w:t xml:space="preserve">This study compared six sentiment-classification configurations on 14,485 airline customer tweets, using a documented preprocessing pipeline, three feature representations and a single held-out test set. The </w:t>
       </w:r>
       <w:r>
         <w:rPr>
@@ -10555,12 +10491,12 @@
         <w:t>Linear SVM (word+char)</w:t>
       </w:r>
       <w:r>
-        <w:t xml:space="preserve"> performed best (accuracy 0.814, macro-F1 0.766), ahead of the BiLSTM (0.762). Well-tuned linear models on TF-IDF n-grams remain very strong for short customer feedback: they are accurate, fast, cheap to run and easy to explain to business users. Neutral messages remain the main source of error, and better neutral-class performance is where more advanced models are most likely to add value.</w:t>
+        <w:t xml:space="preserve"> performed best (accuracy 0.814, macro-F1 0.766), ahead of the BiLSTM (0.762). The results favour TF-IDF linear classifiers as computationally economical candidates for short customer feedback; they were competitive with the evaluated BiLSTM in this experiment. Neutral-class performance remains weaker than performance on the other classes, making ambiguous messages a priority for further evaluation.</w:t>
       </w:r>
     </w:p>
     <w:p>
       <w:r>
-        <w:t>For business decision-making, the model can (1) triage incoming tweets so that most complaints reach an agent quickly, with an explicit, adjustable trade-off between missed complaints and workload; (2) track airline-level sentiment almost as accurately as human labelling; and (3) identify frequent annotated themes involving delays, waiting time and customer-service availability in this dataset, without establishing causal drivers. Ambiguous cases should still be reviewed by people, and the model should be retrained as customer language changes.</w:t>
+        <w:t>The measured performance warrants further evaluation of complaint routing and sentiment monitoring. Exploratory thresholds demonstrate the tradeoff between missed complaints and review workload, while aggregate scores show how prediction errors can affect airline comparisons. Existing complaint annotations identify themes for operational investigation. Before deployment, thresholds should be selected on development data and assessed on fresh data, with human review and ongoing performance monitoring.</w:t>
       </w:r>
     </w:p>
     <w:p>
@@ -11199,7 +11135,7 @@
         <w:t>notebooks/sentiment_analysis.ipynb</w:t>
       </w:r>
       <w:r>
-        <w:t xml:space="preserve"> walks through each step with explanations. All randomness is controlled by one seed (42), and the test-set membership of every tweet is recorded in </w:t>
+        <w:t xml:space="preserve"> walks through each step with explanations. Stochastic components use a common seed (42), and the test-set membership of every tweet is recorded in </w:t>
       </w:r>
       <w:r>
         <w:rPr>
@@ -11209,7 +11145,7 @@
         <w:t>results/metrics/split_assignment.csv</w:t>
       </w:r>
       <w:r>
-        <w:t>.</w:t>
+        <w:t>. Set PYTHONHASHSEED before interpreter startup and use consistent library versions; seeds alone do not guarantee identical results across environments.</w:t>
       </w:r>
     </w:p>
     <w:p>
@@ -11369,7 +11305,7 @@
     </w:p>
     <w:p>
       <w:r>
-        <w:t>Model tuning with leakage-free cross-validation (</w:t>
+        <w:t>Model tuning with feature fitting within cross-validation folds (</w:t>
       </w:r>
       <w:r>
         <w:rPr>

</xml_diff>